<commit_message>
Methods section v86: relabel to match the review workbooks
- Samples CC-1/CC-2; points by mineral and number (ol3 = third olivine point); Map 1/Map 2
- Short procedure, session and grant labels; catalogue numbers dropped from standards;
  procedure material list cut to the minerals analysed
- One RELABEL list in make_highlighted_methods.py, applied to the clean v86 file and to the
  spans v86 shares with v77; v77 stays a snapshot with the old labels (rebuild unchanged)
- Highlighted .md and both .docx rebuilt: 303 highlights, 61% of prose, as before

Co-Authored-By: Claude Opus 5.5 <noreply@anthropic.com>
</commit_message>
<xml_diff>
--- a/Project Files/Reports/EPMA_Reference_Methods_Section_v86.docx
+++ b/Project Files/Reports/EPMA_Reference_Methods_Section_v86.docx
@@ -109,7 +109,7 @@
           <w:b w:val="0"/>
           <w:i w:val="0"/>
         </w:rPr>
-        <w:t>EX-CC-01</w:t>
+        <w:t>CC-1</w:t>
       </w:r>
       <w:r>
         <w:rPr>
@@ -123,7 +123,7 @@
           <w:b w:val="0"/>
           <w:i w:val="0"/>
         </w:rPr>
-        <w:t>IGSN:EXAMPLE0001</w:t>
+        <w:t>IGSN:EX0001</w:t>
       </w:r>
       <w:r>
         <w:rPr>
@@ -137,7 +137,7 @@
           <w:b w:val="0"/>
           <w:i w:val="0"/>
         </w:rPr>
-        <w:t>EX-CC-02</w:t>
+        <w:t>CC-2</w:t>
       </w:r>
       <w:r>
         <w:rPr>
@@ -151,7 +151,7 @@
           <w:b w:val="0"/>
           <w:i w:val="0"/>
         </w:rPr>
-        <w:t>IGSN:EXAMPLE0002</w:t>
+        <w:t>IGSN:EX0002</w:t>
       </w:r>
       <w:r>
         <w:rPr>
@@ -165,7 +165,7 @@
           <w:b w:val="0"/>
           <w:i w:val="0"/>
         </w:rPr>
-        <w:t>silicate minerals (olivine, pyroxene), oxides (magnetite, chromite, ilmenite), sulfides (pyrrhotite, pentlandite), phosphates (apatite, merrillite) and carbonates (calcite, dolomite, breunnerite)</w:t>
+        <w:t>silicate minerals (olivine, pyroxene), oxides (magnetite), sulfides (pyrrhotite), phosphates (apatite) and carbonates (dolomite, calcite)</w:t>
       </w:r>
       <w:r>
         <w:rPr>
@@ -186,7 +186,7 @@
           <w:b w:val="0"/>
           <w:i w:val="0"/>
         </w:rPr>
-        <w:t xml:space="preserve"> together with the standards. EX-CC-02 was </w:t>
+        <w:t xml:space="preserve"> together with the standards. CC-2 was </w:t>
       </w:r>
       <w:r>
         <w:rPr>
@@ -207,7 +207,7 @@
           <w:b w:val="0"/>
           <w:i w:val="0"/>
         </w:rPr>
-        <w:t>Particle P2 of that mount was partly plucked during ion polishing, and all analyses of it lie on the fragment that remained</w:t>
+        <w:t>Its particle carrying the olivine points (ol1–ol8) was partly plucked during ion polishing, and all analyses of it lie on the fragment that remained</w:t>
       </w:r>
       <w:r>
         <w:rPr>
@@ -265,14 +265,14 @@
           <w:b w:val="0"/>
           <w:i w:val="0"/>
         </w:rPr>
-        <w:t>labelled by particle and point number</w:t>
-      </w:r>
-      <w:r>
-        <w:rPr>
-          <w:b w:val="0"/>
-          <w:i w:val="0"/>
-        </w:rPr>
-        <w:t xml:space="preserve"> (for example, EX-CC-01 P1-03), and </w:t>
+        <w:t>labelled by mineral and number</w:t>
+      </w:r>
+      <w:r>
+        <w:rPr>
+          <w:b w:val="0"/>
+          <w:i w:val="0"/>
+        </w:rPr>
+        <w:t xml:space="preserve"> (for example, ol3 in CC-1, the third olivine point), and </w:t>
       </w:r>
       <w:r>
         <w:rPr>
@@ -363,7 +363,7 @@
           <w:b w:val="0"/>
           <w:i w:val="0"/>
         </w:rPr>
-        <w:t>53 point analyses and two maps: 29 points and map M1 on EX-CC-01, and 24 points and map M2 on EX-CC-02</w:t>
+        <w:t>53 point analyses and two maps: 29 points and Map 1 on CC-1, and 24 points and Map 2 on CC-2</w:t>
       </w:r>
       <w:r>
         <w:rPr>
@@ -468,14 +468,14 @@
           <w:b w:val="0"/>
           <w:i w:val="0"/>
         </w:rPr>
-        <w:t xml:space="preserve">EML-EPMA-CC v2, </w:t>
+        <w:t xml:space="preserve">EPMA-CC v2, </w:t>
       </w:r>
       <w:r>
         <w:rPr>
           <w:b w:val="0"/>
           <w:i/>
         </w:rPr>
-        <w:t>EPMA-WDS+EDS major and minor elements in carbonaceous-chondrite silicates, oxides, sulfides, phosphates and carbonates</w:t>
+        <w:t>major and minor elements in carbonaceous-chondrite minerals by WDS and EDS</w:t>
       </w:r>
       <w:r>
         <w:rPr>
@@ -489,7 +489,7 @@
           <w:b w:val="0"/>
           <w:i w:val="0"/>
         </w:rPr>
-        <w:t>doi:10.0000/example.epma-cc.v2</w:t>
+        <w:t>doi:10.0000/epma-cc.v2</w:t>
       </w:r>
       <w:r>
         <w:rPr>
@@ -727,7 +727,7 @@
           <w:b w:val="0"/>
           <w:i w:val="0"/>
         </w:rPr>
-        <w:t>EML-2026-0412-A</w:t>
+        <w:t>2026-04-12</w:t>
       </w:r>
       <w:r>
         <w:rPr>
@@ -1216,7 +1216,7 @@
           <w:b w:val="0"/>
           <w:i w:val="0"/>
         </w:rPr>
-        <w:t>Ca and Mg in carbonates were calibrated on dolomite USNM 10057</w:t>
+        <w:t>Ca and Mg in carbonates were calibrated on dolomite</w:t>
       </w:r>
       <w:r>
         <w:rPr>
@@ -1900,7 +1900,7 @@
                 <w:i w:val="0"/>
                 <w:sz w:val="16"/>
               </w:rPr>
-              <w:t>Microcline USNM 143966</w:t>
+              <w:t>Microcline</w:t>
             </w:r>
           </w:p>
         </w:tc>
@@ -2064,7 +2064,7 @@
                 <w:i w:val="0"/>
                 <w:sz w:val="16"/>
               </w:rPr>
-              <w:t>Scapolite USNM R6600-1</w:t>
+              <w:t>Scapolite</w:t>
             </w:r>
           </w:p>
         </w:tc>
@@ -2400,7 +2400,7 @@
                 <w:i w:val="0"/>
                 <w:sz w:val="16"/>
               </w:rPr>
-              <w:t>Anorthite USNM 137041</w:t>
+              <w:t>Anorthite</w:t>
             </w:r>
           </w:p>
         </w:tc>
@@ -2728,7 +2728,7 @@
                 <w:i w:val="0"/>
                 <w:sz w:val="16"/>
               </w:rPr>
-              <w:t>Ilmenite USNM 96189</w:t>
+              <w:t>Ilmenite</w:t>
             </w:r>
           </w:p>
         </w:tc>
@@ -3548,7 +3548,7 @@
                 <w:i w:val="0"/>
                 <w:sz w:val="16"/>
               </w:rPr>
-              <w:t>Springwater olivine USNM 2566</w:t>
+              <w:t>Springwater olivine</w:t>
             </w:r>
           </w:p>
         </w:tc>
@@ -3712,7 +3712,7 @@
                 <w:i w:val="0"/>
                 <w:sz w:val="16"/>
               </w:rPr>
-              <w:t>Springwater olivine USNM 2566; dolomite USNM 10057 in carbonates</w:t>
+              <w:t>Springwater olivine; dolomite in carbonates</w:t>
             </w:r>
           </w:p>
         </w:tc>
@@ -3876,7 +3876,7 @@
                 <w:i w:val="0"/>
                 <w:sz w:val="16"/>
               </w:rPr>
-              <w:t>Rockport fayalite USNM 85276</w:t>
+              <w:t>Rockport fayalite</w:t>
             </w:r>
           </w:p>
         </w:tc>
@@ -4040,7 +4040,7 @@
                 <w:i w:val="0"/>
                 <w:sz w:val="16"/>
               </w:rPr>
-              <w:t>Diopside USNM 117733; dolomite USNM 10057 in carbonates</w:t>
+              <w:t>Diopside; dolomite in carbonates</w:t>
             </w:r>
           </w:p>
         </w:tc>
@@ -4355,7 +4355,7 @@
           <w:b w:val="0"/>
           <w:i w:val="0"/>
         </w:rPr>
-        <w:t>P1 of EX-CC-01 as map M1, and P1 of EX-CC-02 as map M2</w:t>
+        <w:t>Map 1 in CC-1 and Map 2 in CC-2</w:t>
       </w:r>
       <w:r>
         <w:rPr>
@@ -4460,7 +4460,7 @@
           <w:b w:val="0"/>
           <w:i w:val="0"/>
         </w:rPr>
-        <w:t xml:space="preserve">. Map M1 (EX-CC-01) covered </w:t>
+        <w:t xml:space="preserve">. Map 1 (CC-1) covered </w:t>
       </w:r>
       <w:r>
         <w:rPr>
@@ -4488,7 +4488,7 @@
           <w:b w:val="0"/>
           <w:i w:val="0"/>
         </w:rPr>
-        <w:t xml:space="preserve">. Map M2 (EX-CC-02) covered </w:t>
+        <w:t xml:space="preserve">. Map 2 (CC-2) covered </w:t>
       </w:r>
       <w:r>
         <w:rPr>
@@ -5068,7 +5068,7 @@
           <w:b w:val="0"/>
           <w:i w:val="0"/>
         </w:rPr>
-        <w:t>all points of the olivine (8), pyroxene (4) and magnetite (6) means of EX-CC-01; 3 of 5 pyrrhotite and 4 of 6 apatite points of EX-CC-01; and 8 of 10 dolomite, 5 of 6 calcite and 7 of 8 olivine points of EX-CC-02</w:t>
+        <w:t>all points of the olivine (8), pyroxene (4) and magnetite (6) means of CC-1; 3 of 5 pyrrhotite and 4 of 6 apatite points of CC-1; and 8 of 10 dolomite, 5 of 6 calcite and 7 of 8 olivine points of CC-2</w:t>
       </w:r>
       <w:r>
         <w:rPr>
@@ -5082,7 +5082,7 @@
           <w:b w:val="0"/>
           <w:i w:val="0"/>
         </w:rPr>
-        <w:t>Four were excluded for totals outside the window: EX-CC-01 P3-02 and P3-05 (apatite), and EX-CC-02 P1-03 and P1-07 (dolomite)</w:t>
+        <w:t>Four were excluded for totals outside the window: ap2 and ap5 in CC-1 (apatite), and dol3 and dol7 in CC-2 (dolomite)</w:t>
       </w:r>
       <w:r>
         <w:rPr>
@@ -5096,7 +5096,7 @@
           <w:b w:val="0"/>
           <w:i w:val="0"/>
         </w:rPr>
-        <w:t>Three were excluded because they overlapped a neighbouring phase: EX-CC-01 P2-07 and P2-09 (pyrrhotite beside pentlandite), and EX-CC-02 P1-16 (calcite at a grain boundary)</w:t>
+        <w:t>Three were excluded because they overlapped a neighbouring phase: po1 and po3 in CC-1 (pyrrhotite beside pentlandite), and cal6 in CC-2 (calcite at a grain boundary)</w:t>
       </w:r>
       <w:r>
         <w:rPr>
@@ -5110,7 +5110,7 @@
           <w:b w:val="0"/>
           <w:i w:val="0"/>
         </w:rPr>
-        <w:t>One, EX-CC-02 P2-05, was excluded for beam-current drift</w:t>
+        <w:t>One, ol5 in CC-2, was excluded for beam-current drift</w:t>
       </w:r>
       <w:r>
         <w:rPr>
@@ -5159,7 +5159,7 @@
           <w:b w:val="0"/>
           <w:i w:val="0"/>
         </w:rPr>
-        <w:t>San Carlos olivine USNM 111312/444 (n = 9)</w:t>
+        <w:t>San Carlos olivine (n = 9)</w:t>
       </w:r>
       <w:r>
         <w:rPr>
@@ -5173,7 +5173,7 @@
           <w:b w:val="0"/>
           <w:i w:val="0"/>
         </w:rPr>
-        <w:t>Kakanui augite USNM 122142 (n = 6)</w:t>
+        <w:t>Kakanui augite (n = 6)</w:t>
       </w:r>
       <w:r>
         <w:rPr>
@@ -5187,7 +5187,7 @@
           <w:b w:val="0"/>
           <w:i w:val="0"/>
         </w:rPr>
-        <w:t>Durango apatite USNM 104021 (n = 6)</w:t>
+        <w:t>Durango apatite (n = 6)</w:t>
       </w:r>
       <w:r>
         <w:rPr>
@@ -5201,7 +5201,7 @@
           <w:b w:val="0"/>
           <w:i w:val="0"/>
         </w:rPr>
-        <w:t>chromite USNM 117075 (n = 5)</w:t>
+        <w:t>chromite (n = 5)</w:t>
       </w:r>
       <w:r>
         <w:rPr>
@@ -5215,7 +5215,7 @@
           <w:b w:val="0"/>
           <w:i w:val="0"/>
         </w:rPr>
-        <w:t>calcite USNM 136321 (n = 6)</w:t>
+        <w:t>calcite (n = 6)</w:t>
       </w:r>
       <w:r>
         <w:rPr>
@@ -5366,7 +5366,7 @@
           <w:b w:val="0"/>
           <w:i w:val="0"/>
         </w:rPr>
-        <w:t xml:space="preserve">. For olivine in EX-CC-01 (n = 8), the MSWD ranged from </w:t>
+        <w:t xml:space="preserve">. For olivine in CC-1 (n = 8), the MSWD ranged from </w:t>
       </w:r>
       <w:r>
         <w:rPr>
@@ -5394,7 +5394,7 @@
           <w:b w:val="0"/>
           <w:i w:val="0"/>
         </w:rPr>
-        <w:t xml:space="preserve">, consistent with the Fe–Mg zoning visible in map M1. The standard errors of that mean were </w:t>
+        <w:t xml:space="preserve">, consistent with the Fe–Mg zoning visible in Map 1. The standard errors of that mean were </w:t>
       </w:r>
       <w:r>
         <w:rPr>
@@ -5576,7 +5576,7 @@
           <w:b w:val="0"/>
           <w:i w:val="0"/>
         </w:rPr>
-        <w:t>Example Agency award EX-INST-0001</w:t>
+        <w:t>Example Agency grant A</w:t>
       </w:r>
       <w:r>
         <w:rPr>
@@ -5590,7 +5590,7 @@
           <w:b w:val="0"/>
           <w:i w:val="0"/>
         </w:rPr>
-        <w:t>award EX-DEV-0002</w:t>
+        <w:t>grant B</w:t>
       </w:r>
       <w:r>
         <w:rPr>
@@ -5604,7 +5604,7 @@
           <w:b w:val="0"/>
           <w:i w:val="0"/>
         </w:rPr>
-        <w:t>Example Agency award EX-SCI-0003</w:t>
+        <w:t>Example Agency grant C</w:t>
       </w:r>
       <w:r>
         <w:rPr>
@@ -5639,7 +5639,7 @@
           <w:b w:val="0"/>
           <w:i w:val="0"/>
         </w:rPr>
-        <w:t>EML-2026-0412-A</w:t>
+        <w:t>2026-04-12</w:t>
       </w:r>
       <w:r>
         <w:rPr>
@@ -5653,7 +5653,7 @@
           <w:b w:val="0"/>
           <w:i w:val="0"/>
         </w:rPr>
-        <w:t>doi:10.0000/example.epma-cc.v2</w:t>
+        <w:t>doi:10.0000/epma-cc.v2</w:t>
       </w:r>
       <w:r>
         <w:rPr>
@@ -5914,7 +5914,7 @@
           <w:b w:val="0"/>
           <w:i w:val="0"/>
         </w:rPr>
-        <w:t xml:space="preserve"> Example et al. (2025), doi:10.0000/example.2025.001.</w:t>
+        <w:t xml:space="preserve"> Example et al. (2025).</w:t>
       </w:r>
     </w:p>
     <w:sectPr>

</xml_diff>